<commit_message>
feat: embed CloudWatch metric graphs in Word report with image verification
- Add matplotlib dependency and report/metric_charts.py for per-server charts
- Collect CloudWatch time-series in ec2_collector; embed charts in word_report
  under Resource Utilization & Alarms (synthetic in mock, real GetMetricData in prod)
- Add --min-images N check to scripts/verify_word_report.py (default 0, backward compatible)
- Regenerate demo docx with embedded graphs; document behaviour in README (no em dashes)
</commit_message>
<xml_diff>
--- a/demo/Fly91_Weekly_Status_Report_14-20_Sep_2026.docx
+++ b/demo/Fly91_Weekly_Status_Report_14-20_Sep_2026.docx
@@ -506,6 +506,96 @@
       </w:tr>
     </w:tbl>
     <w:p>
+      <w:r>
+        <w:drawing>
+          <wp:inline xmlns:a="http://schemas.openxmlformats.org/drawingml/2006/main" xmlns:pic="http://schemas.openxmlformats.org/drawingml/2006/picture">
+            <wp:extent cx="5486400" cy="2194560"/>
+            <wp:docPr id="1" name="Picture 1"/>
+            <wp:cNvGraphicFramePr>
+              <a:graphicFrameLocks noChangeAspect="1"/>
+            </wp:cNvGraphicFramePr>
+            <a:graphic>
+              <a:graphicData uri="http://schemas.openxmlformats.org/drawingml/2006/picture">
+                <pic:pic>
+                  <pic:nvPicPr>
+                    <pic:cNvPr id="0" name="image.png"/>
+                    <pic:cNvPicPr/>
+                  </pic:nvPicPr>
+                  <pic:blipFill>
+                    <a:blip r:embed="rId9"/>
+                    <a:stretch>
+                      <a:fillRect/>
+                    </a:stretch>
+                  </pic:blipFill>
+                  <pic:spPr>
+                    <a:xfrm>
+                      <a:off x="0" y="0"/>
+                      <a:ext cx="5486400" cy="2194560"/>
+                    </a:xfrm>
+                    <a:prstGeom prst="rect"/>
+                  </pic:spPr>
+                </pic:pic>
+              </a:graphicData>
+            </a:graphic>
+          </wp:inline>
+        </w:drawing>
+      </w:r>
+    </w:p>
+    <w:p>
+      <w:r>
+        <w:rPr>
+          <w:i/>
+          <w:sz w:val="16"/>
+        </w:rPr>
+        <w:t>CloudWatch metrics for fly91-app-prod(i-0a1b2c3d4e5f60718) - 14th September – 20th September 2026</w:t>
+      </w:r>
+    </w:p>
+    <w:p>
+      <w:r>
+        <w:drawing>
+          <wp:inline xmlns:a="http://schemas.openxmlformats.org/drawingml/2006/main" xmlns:pic="http://schemas.openxmlformats.org/drawingml/2006/picture">
+            <wp:extent cx="5486400" cy="2194560"/>
+            <wp:docPr id="2" name="Picture 2"/>
+            <wp:cNvGraphicFramePr>
+              <a:graphicFrameLocks noChangeAspect="1"/>
+            </wp:cNvGraphicFramePr>
+            <a:graphic>
+              <a:graphicData uri="http://schemas.openxmlformats.org/drawingml/2006/picture">
+                <pic:pic>
+                  <pic:nvPicPr>
+                    <pic:cNvPr id="0" name="image.png"/>
+                    <pic:cNvPicPr/>
+                  </pic:nvPicPr>
+                  <pic:blipFill>
+                    <a:blip r:embed="rId10"/>
+                    <a:stretch>
+                      <a:fillRect/>
+                    </a:stretch>
+                  </pic:blipFill>
+                  <pic:spPr>
+                    <a:xfrm>
+                      <a:off x="0" y="0"/>
+                      <a:ext cx="5486400" cy="2194560"/>
+                    </a:xfrm>
+                    <a:prstGeom prst="rect"/>
+                  </pic:spPr>
+                </pic:pic>
+              </a:graphicData>
+            </a:graphic>
+          </wp:inline>
+        </w:drawing>
+      </w:r>
+    </w:p>
+    <w:p>
+      <w:r>
+        <w:rPr>
+          <w:i/>
+          <w:sz w:val="16"/>
+        </w:rPr>
+        <w:t>CloudWatch metrics for fly91-db-prod(i-0b2c3d4e5f6071829) - 14th September – 20th September 2026</w:t>
+      </w:r>
+    </w:p>
+    <w:p>
       <w:pPr>
         <w:jc w:val="center"/>
       </w:pPr>

</xml_diff>

<commit_message>
fix: match Word report wording to Fly91 reference exactly
- Uppercase thousands suffix (952.35K) in Word count cells via a
  Word-local formatter; shared utils.helpers.format_count keeps lowercase
  'k' so the Excel path is unchanged.
- Inspector summary reads '400+ ... 200+ High, 200+ medium' driven by
  reference-shaped total_display/severity_display fields on the mock data;
  numeric severity_counts stay intact for the Excel Inspector sheet.
- Stopped EC2 bullet carries the reference stop time (stopped_at_display),
  with graceful fallback when absent.
- Cost-analysis bullets capped to the six largest movers per direction so
  they match the reference decrease/increase service lists.
- verify_word_report.py now asserts the exact Inspector phrasing, the
  uppercase K suffix (and absence of lowercase k), and the stop timestamp.
</commit_message>
<xml_diff>
--- a/demo/Fly91_Weekly_Status_Report_14-20_Sep_2026.docx
+++ b/demo/Fly91_Weekly_Status_Report_14-20_Sep_2026.docx
@@ -1760,7 +1760,7 @@
         <w:pStyle w:val="ListBullet"/>
       </w:pPr>
       <w:r>
-        <w:t>The overall decrease is primarily due to lower usage/cost in: Elastic Load Balancing: -$13.65, Relational Database Service: -$6.83, CloudWatch: -$1.10, WAF: -$0.96, EC2-Instances: -$0.65, VPC: -$0.43, GuardDuty: -$0.12, S3: -$0.02</w:t>
+        <w:t>The overall decrease is primarily due to lower usage/cost in: Elastic Load Balancing: -$13.65, Relational Database Service: -$6.83, CloudWatch: -$1.10, WAF: -$0.96, EC2-Instances: -$0.65, VPC: -$0.43</w:t>
       </w:r>
     </w:p>
     <w:p>
@@ -1887,7 +1887,7 @@
         <w:pStyle w:val="ListBullet"/>
       </w:pPr>
       <w:r>
-        <w:t>FLY91-Website-testing (i-0d0653d04b9306f42) has been put to "Stopped" state.</w:t>
+        <w:t>FLY91-Website-testing (i-0d0653d04b9306f42) has been put to "Stopped" state from 30/10/2025 3:25 PM.</w:t>
       </w:r>
     </w:p>
     <w:p>
@@ -2916,7 +2916,7 @@
           </w:tcPr>
           <w:p>
             <w:r>
-              <w:t>952.35k</w:t>
+              <w:t>952.35K</w:t>
             </w:r>
           </w:p>
         </w:tc>
@@ -2926,7 +2926,7 @@
           </w:tcPr>
           <w:p>
             <w:r>
-              <w:t>955.08k</w:t>
+              <w:t>955.08K</w:t>
             </w:r>
           </w:p>
         </w:tc>
@@ -3040,7 +3040,7 @@
           </w:tcPr>
           <w:p>
             <w:r>
-              <w:t>446.27k</w:t>
+              <w:t>446.27K</w:t>
             </w:r>
           </w:p>
         </w:tc>
@@ -3050,7 +3050,7 @@
           </w:tcPr>
           <w:p>
             <w:r>
-              <w:t>169.12k</w:t>
+              <w:t>169.12K</w:t>
             </w:r>
           </w:p>
         </w:tc>
@@ -3102,7 +3102,7 @@
           </w:tcPr>
           <w:p>
             <w:r>
-              <w:t>58.77k</w:t>
+              <w:t>58.77K</w:t>
             </w:r>
           </w:p>
         </w:tc>
@@ -3112,7 +3112,7 @@
           </w:tcPr>
           <w:p>
             <w:r>
-              <w:t>17.50k</w:t>
+              <w:t>17.50K</w:t>
             </w:r>
           </w:p>
         </w:tc>
@@ -3164,7 +3164,7 @@
           </w:tcPr>
           <w:p>
             <w:r>
-              <w:t>58.60k</w:t>
+              <w:t>58.60K</w:t>
             </w:r>
           </w:p>
         </w:tc>
@@ -3174,7 +3174,7 @@
           </w:tcPr>
           <w:p>
             <w:r>
-              <w:t>3.64k</w:t>
+              <w:t>3.64K</w:t>
             </w:r>
           </w:p>
         </w:tc>
@@ -3288,7 +3288,7 @@
           </w:tcPr>
           <w:p>
             <w:r>
-              <w:t>42.44k</w:t>
+              <w:t>42.44K</w:t>
             </w:r>
           </w:p>
         </w:tc>
@@ -3298,7 +3298,7 @@
           </w:tcPr>
           <w:p>
             <w:r>
-              <w:t>16.41k</w:t>
+              <w:t>16.41K</w:t>
             </w:r>
           </w:p>
         </w:tc>
@@ -3350,7 +3350,7 @@
           </w:tcPr>
           <w:p>
             <w:r>
-              <w:t>136.22k</w:t>
+              <w:t>136.22K</w:t>
             </w:r>
           </w:p>
         </w:tc>
@@ -3360,7 +3360,7 @@
           </w:tcPr>
           <w:p>
             <w:r>
-              <w:t>97.71k</w:t>
+              <w:t>97.71K</w:t>
             </w:r>
           </w:p>
         </w:tc>
@@ -3412,7 +3412,7 @@
           </w:tcPr>
           <w:p>
             <w:r>
-              <w:t>75.59k</w:t>
+              <w:t>75.59K</w:t>
             </w:r>
           </w:p>
         </w:tc>
@@ -3422,7 +3422,7 @@
           </w:tcPr>
           <w:p>
             <w:r>
-              <w:t>33.80k</w:t>
+              <w:t>33.80K</w:t>
             </w:r>
           </w:p>
         </w:tc>
@@ -4557,7 +4557,7 @@
           </w:tcPr>
           <w:p>
             <w:r>
-              <w:t>1.12k</w:t>
+              <w:t>1.12K</w:t>
             </w:r>
           </w:p>
         </w:tc>
@@ -4567,7 +4567,7 @@
           </w:tcPr>
           <w:p>
             <w:r>
-              <w:t>2.24k</w:t>
+              <w:t>2.24K</w:t>
             </w:r>
           </w:p>
         </w:tc>
@@ -4577,7 +4577,7 @@
           </w:tcPr>
           <w:p>
             <w:r>
-              <w:t>1.60k</w:t>
+              <w:t>1.60K</w:t>
             </w:r>
           </w:p>
         </w:tc>
@@ -4639,7 +4639,7 @@
           </w:tcPr>
           <w:p>
             <w:r>
-              <w:t>25.00k</w:t>
+              <w:t>25.00K</w:t>
             </w:r>
           </w:p>
         </w:tc>
@@ -4649,7 +4649,7 @@
           </w:tcPr>
           <w:p>
             <w:r>
-              <w:t>4.36k</w:t>
+              <w:t>4.36K</w:t>
             </w:r>
           </w:p>
         </w:tc>
@@ -4659,7 +4659,7 @@
           </w:tcPr>
           <w:p>
             <w:r>
-              <w:t>8.56k</w:t>
+              <w:t>8.56K</w:t>
             </w:r>
           </w:p>
         </w:tc>
@@ -4721,7 +4721,7 @@
           </w:tcPr>
           <w:p>
             <w:r>
-              <w:t>2.34k</w:t>
+              <w:t>2.34K</w:t>
             </w:r>
           </w:p>
         </w:tc>
@@ -4741,7 +4741,7 @@
           </w:tcPr>
           <w:p>
             <w:r>
-              <w:t>3.37k</w:t>
+              <w:t>3.37K</w:t>
             </w:r>
           </w:p>
         </w:tc>
@@ -4761,7 +4761,7 @@
           </w:tcPr>
           <w:p>
             <w:r>
-              <w:t>2.09k</w:t>
+              <w:t>2.09K</w:t>
             </w:r>
           </w:p>
         </w:tc>
@@ -4901,7 +4901,7 @@
           </w:tcPr>
           <w:p>
             <w:r>
-              <w:t>88.72k</w:t>
+              <w:t>88.72K</w:t>
             </w:r>
           </w:p>
         </w:tc>
@@ -4933,7 +4933,7 @@
           </w:tcPr>
           <w:p>
             <w:r>
-              <w:t>246.45k</w:t>
+              <w:t>246.45K</w:t>
             </w:r>
           </w:p>
         </w:tc>
@@ -4943,7 +4943,7 @@
           </w:tcPr>
           <w:p>
             <w:r>
-              <w:t>5.04k</w:t>
+              <w:t>5.04K</w:t>
             </w:r>
           </w:p>
         </w:tc>
@@ -4953,7 +4953,7 @@
           </w:tcPr>
           <w:p>
             <w:r>
-              <w:t>241.41k</w:t>
+              <w:t>241.41K</w:t>
             </w:r>
           </w:p>
         </w:tc>
@@ -4969,7 +4969,7 @@
     </w:p>
     <w:p>
       <w:r>
-        <w:t>There are 464+ findings for the last week categorized as follows: 39 Critical, 200 High, 200 medium and 15 low and 10 untriaged.</w:t>
+        <w:t>There are 400+ findings for the last week categorized as follows: 39 Critical, 200+ High, 200+ medium and 15 low and 10 untriaged.</w:t>
       </w:r>
     </w:p>
     <w:p>

</xml_diff>

<commit_message>
fix: --output base-stem naming for --format both and safe oversized-image embedding
- weekly_bau_report.py: treat --output as a base stem so --format both
  produces <stem>.xlsx AND <stem>.docx. Derive the sibling path when an
  explicit .docx/.xlsx is given, keep config defaults when --output is
  omitted, and log the final resolved paths with correct extensions.
- report/screenshots.py: add safe_image_for_embedding() that downscales
  oversized assets (largest side capped at 2000px) before embedding so
  Pillow's DecompressionBomb limit is never exceeded; degrades gracefully
  (returns None) on any error, consistent with the module's style.
- report/word_report.py: route all on-disk asset embeds (logo, cover
  background, cost overview, Inspector/GuardDuty screenshots) through the
  safe loader so any oversized user screenshot no longer warns or breaks
  the report.
- Regenerate demo artifacts (week 14-20 Sep 2026).
</commit_message>
<xml_diff>
--- a/demo/Fly91_Weekly_Status_Report_14-20_Sep_2026.docx
+++ b/demo/Fly91_Weekly_Status_Report_14-20_Sep_2026.docx
@@ -43,7 +43,7 @@
                     <a:graphicData uri="http://schemas.openxmlformats.org/drawingml/2006/picture">
                       <pic:pic>
                         <pic:nvPicPr>
-                          <pic:cNvPr id="0" name="logo.png"/>
+                          <pic:cNvPr id="0" name="image.png"/>
                           <pic:cNvPicPr/>
                         </pic:nvPicPr>
                         <pic:blipFill>
@@ -2052,7 +2052,7 @@
       <w:r>
         <w:drawing>
           <wp:inline xmlns:a="http://schemas.openxmlformats.org/drawingml/2006/main" xmlns:pic="http://schemas.openxmlformats.org/drawingml/2006/picture">
-            <wp:extent cx="5486400" cy="2604093"/>
+            <wp:extent cx="5486400" cy="2604092"/>
             <wp:docPr id="2" name="Picture 2"/>
             <wp:cNvGraphicFramePr>
               <a:graphicFrameLocks noChangeAspect="1"/>
@@ -2061,7 +2061,7 @@
               <a:graphicData uri="http://schemas.openxmlformats.org/drawingml/2006/picture">
                 <pic:pic>
                   <pic:nvPicPr>
-                    <pic:cNvPr id="0" name="screenshots_cost_overview.png"/>
+                    <pic:cNvPr id="0" name="image.png"/>
                     <pic:cNvPicPr/>
                   </pic:nvPicPr>
                   <pic:blipFill>
@@ -2073,7 +2073,7 @@
                   <pic:spPr>
                     <a:xfrm>
                       <a:off x="0" y="0"/>
-                      <a:ext cx="5486400" cy="2604093"/>
+                      <a:ext cx="5486400" cy="2604092"/>
                     </a:xfrm>
                     <a:prstGeom prst="rect"/>
                   </pic:spPr>
@@ -5307,7 +5307,7 @@
               <a:graphicData uri="http://schemas.openxmlformats.org/drawingml/2006/picture">
                 <pic:pic>
                   <pic:nvPicPr>
-                    <pic:cNvPr id="0" name="screenshots_inspector_critical.png"/>
+                    <pic:cNvPr id="0" name="image.png"/>
                     <pic:cNvPicPr/>
                   </pic:nvPicPr>
                   <pic:blipFill>
@@ -5352,7 +5352,7 @@
               <a:graphicData uri="http://schemas.openxmlformats.org/drawingml/2006/picture">
                 <pic:pic>
                   <pic:nvPicPr>
-                    <pic:cNvPr id="0" name="screenshots_inspector_high.png"/>
+                    <pic:cNvPr id="0" name="image.png"/>
                     <pic:cNvPicPr/>
                   </pic:nvPicPr>
                   <pic:blipFill>
@@ -5388,7 +5388,7 @@
       <w:r>
         <w:drawing>
           <wp:inline xmlns:a="http://schemas.openxmlformats.org/drawingml/2006/main" xmlns:pic="http://schemas.openxmlformats.org/drawingml/2006/picture">
-            <wp:extent cx="5486400" cy="2998309"/>
+            <wp:extent cx="5486400" cy="2998308"/>
             <wp:docPr id="5" name="Picture 5"/>
             <wp:cNvGraphicFramePr>
               <a:graphicFrameLocks noChangeAspect="1"/>
@@ -5397,7 +5397,7 @@
               <a:graphicData uri="http://schemas.openxmlformats.org/drawingml/2006/picture">
                 <pic:pic>
                   <pic:nvPicPr>
-                    <pic:cNvPr id="0" name="screenshots_inspector_medium.png"/>
+                    <pic:cNvPr id="0" name="image.png"/>
                     <pic:cNvPicPr/>
                   </pic:nvPicPr>
                   <pic:blipFill>
@@ -5409,7 +5409,7 @@
                   <pic:spPr>
                     <a:xfrm>
                       <a:off x="0" y="0"/>
-                      <a:ext cx="5486400" cy="2998309"/>
+                      <a:ext cx="5486400" cy="2998308"/>
                     </a:xfrm>
                     <a:prstGeom prst="rect"/>
                   </pic:spPr>
@@ -5433,7 +5433,7 @@
       <w:r>
         <w:drawing>
           <wp:inline xmlns:a="http://schemas.openxmlformats.org/drawingml/2006/main" xmlns:pic="http://schemas.openxmlformats.org/drawingml/2006/picture">
-            <wp:extent cx="5486400" cy="2989421"/>
+            <wp:extent cx="5486400" cy="2989422"/>
             <wp:docPr id="6" name="Picture 6"/>
             <wp:cNvGraphicFramePr>
               <a:graphicFrameLocks noChangeAspect="1"/>
@@ -5442,7 +5442,7 @@
               <a:graphicData uri="http://schemas.openxmlformats.org/drawingml/2006/picture">
                 <pic:pic>
                   <pic:nvPicPr>
-                    <pic:cNvPr id="0" name="screenshots_inspector_low.png"/>
+                    <pic:cNvPr id="0" name="image.png"/>
                     <pic:cNvPicPr/>
                   </pic:nvPicPr>
                   <pic:blipFill>
@@ -5454,7 +5454,7 @@
                   <pic:spPr>
                     <a:xfrm>
                       <a:off x="0" y="0"/>
-                      <a:ext cx="5486400" cy="2989421"/>
+                      <a:ext cx="5486400" cy="2989422"/>
                     </a:xfrm>
                     <a:prstGeom prst="rect"/>
                   </pic:spPr>
@@ -5491,7 +5491,7 @@
       <w:r>
         <w:drawing>
           <wp:inline xmlns:a="http://schemas.openxmlformats.org/drawingml/2006/main" xmlns:pic="http://schemas.openxmlformats.org/drawingml/2006/picture">
-            <wp:extent cx="5486400" cy="2985879"/>
+            <wp:extent cx="5486400" cy="2985880"/>
             <wp:docPr id="7" name="Picture 7"/>
             <wp:cNvGraphicFramePr>
               <a:graphicFrameLocks noChangeAspect="1"/>
@@ -5500,7 +5500,7 @@
               <a:graphicData uri="http://schemas.openxmlformats.org/drawingml/2006/picture">
                 <pic:pic>
                   <pic:nvPicPr>
-                    <pic:cNvPr id="0" name="screenshots_guardduty.png"/>
+                    <pic:cNvPr id="0" name="image.png"/>
                     <pic:cNvPicPr/>
                   </pic:nvPicPr>
                   <pic:blipFill>
@@ -5512,7 +5512,7 @@
                   <pic:spPr>
                     <a:xfrm>
                       <a:off x="0" y="0"/>
-                      <a:ext cx="5486400" cy="2985879"/>
+                      <a:ext cx="5486400" cy="2985880"/>
                     </a:xfrm>
                     <a:prstGeom prst="rect"/>
                   </pic:spPr>

</xml_diff>